<commit_message>
IPD planning list of candidate reports (tiers A/B/C/R), generator, pointer in e-mail draft; log
Co-Authored-By: Claude Sonnet 5.5 <noreply@anthropic.com>
Claude-Session: https://claude.ai/code/session_01FRD7etKqYN8v2bbXeeLMRW
</commit_message>
<xml_diff>
--- a/IPD request emails (draft).docx
+++ b/IPD request emails (draft).docx
@@ -1674,6 +1674,84 @@
           <w:rFonts w:ascii="Calibri" w:cs="Calibri" w:eastAsia="Microsoft YaHei" w:hAnsi="Calibri"/>
         </w:rPr>
         <w:t xml:space="preserve">6. 已知的两个重点系列（只看过摘要，未核对全文）</w:t>
+      </w:r>
+    </w:p>
+    <w:p>
+      <w:pPr>
+        <w:spacing w:after="120"/>
+      </w:pPr>
+      <w:r>
+        <w:rPr>
+          <w:rFonts w:ascii="Calibri" w:cs="Calibri" w:eastAsia="Microsoft YaHei" w:hAnsi="Calibri"/>
+          <w:b/>
+          <w:bCs/>
+        </w:rPr>
+        <w:t xml:space="preserve">2026 年 10 月 19 日补充：</w:t>
+      </w:r>
+      <w:r>
+        <w:rPr>
+          <w:rFonts w:ascii="Calibri" w:cs="Calibri" w:eastAsia="Microsoft YaHei" w:hAnsi="Calibri"/>
+        </w:rPr>
+        <w:t xml:space="preserve"> 全文阶段之前的规划用候选清单在 </w:t>
+      </w:r>
+      <w:r>
+        <w:rPr>
+          <w:rFonts w:ascii="Consolas" w:cs="Consolas" w:eastAsia="Microsoft YaHei" w:hAnsi="Consolas"/>
+          <w:sz w:val="19"/>
+          <w:szCs w:val="19"/>
+          <w:shd w:fill="EEEEEE" w:val="clear"/>
+        </w:rPr>
+        <w:t xml:space="preserve">search/ipd/ipd_target_candidates.xlsx</w:t>
+      </w:r>
+      <w:r>
+        <w:rPr>
+          <w:rFonts w:ascii="Calibri" w:cs="Calibri" w:eastAsia="Microsoft YaHei" w:hAnsi="Calibri"/>
+        </w:rPr>
+        <w:t xml:space="preserve">（脚本 </w:t>
+      </w:r>
+      <w:r>
+        <w:rPr>
+          <w:rFonts w:ascii="Consolas" w:cs="Consolas" w:eastAsia="Microsoft YaHei" w:hAnsi="Consolas"/>
+          <w:sz w:val="19"/>
+          <w:szCs w:val="19"/>
+          <w:shd w:fill="EEEEEE" w:val="clear"/>
+        </w:rPr>
+        <w:t xml:space="preserve">tools/make_ipd_target_candidates.py</w:t>
+      </w:r>
+      <w:r>
+        <w:rPr>
+          <w:rFonts w:ascii="Calibri" w:cs="Calibri" w:eastAsia="Microsoft YaHei" w:hAnsi="Calibri"/>
+        </w:rPr>
+        <w:t xml:space="preserve">）：540 篇待取全文的报告里，预试验读过全文、没有逐例数据的 4 篇（A 层）、标题或摘要写了 3 例以上的 26 篇（B 层）、有 series/回顾等字样但没有数字的 3 篇（C 层）、综述类 3 篇（R 层）。它只用来估计这一批邮件有多少封，</w:t>
+      </w:r>
+      <w:r>
+        <w:rPr>
+          <w:rFonts w:ascii="Calibri" w:cs="Calibri" w:eastAsia="Microsoft YaHei" w:hAnsi="Calibri"/>
+          <w:b/>
+          <w:bCs/>
+        </w:rPr>
+        <w:t xml:space="preserve">不是目标清单</w:t>
+      </w:r>
+      <w:r>
+        <w:rPr>
+          <w:rFonts w:ascii="Calibri" w:cs="Calibri" w:eastAsia="Microsoft YaHei" w:hAnsi="Calibri"/>
+        </w:rPr>
+        <w:t xml:space="preserve">：目标清单要等两位全文筛选员都记 Pending IPD（理由 A）并解决分歧之后，由 </w:t>
+      </w:r>
+      <w:r>
+        <w:rPr>
+          <w:rFonts w:ascii="Consolas" w:cs="Consolas" w:eastAsia="Microsoft YaHei" w:hAnsi="Consolas"/>
+          <w:sz w:val="19"/>
+          <w:szCs w:val="19"/>
+          <w:shd w:fill="EEEEEE" w:val="clear"/>
+        </w:rPr>
+        <w:t xml:space="preserve">fulltext_pending_ipd.csv</w:t>
+      </w:r>
+      <w:r>
+        <w:rPr>
+          <w:rFonts w:ascii="Calibri" w:cs="Calibri" w:eastAsia="Microsoft YaHei" w:hAnsi="Calibri"/>
+        </w:rPr>
+        <w:t xml:space="preserve"> 给出。下面这两个系列都在候选清单的 B 层。</w:t>
       </w:r>
     </w:p>
     <w:p>

</xml_diff>

<commit_message>
Add contact routes and contact logging to the IPD request e-mail checklist
Co-Authored-By: Claude Sonnet 5.5 <noreply@anthropic.com>
Claude-Session: https://claude.ai/code/session_01FRD7etKqYN8v2bbXeeLMRW
</commit_message>
<xml_diff>
--- a/IPD request emails (draft).docx
+++ b/IPD request emails (draft).docx
@@ -22,7 +22,7 @@
         <w:rPr>
           <w:rFonts w:ascii="Calibri" w:cs="Calibri" w:eastAsia="Microsoft YaHei" w:hAnsi="Calibri"/>
         </w:rPr>
-        <w:t xml:space="preserve">项目：儿童游走脾系统综述（PROSPERO CRD420261520329）。草稿日期：2026 年 10 月 18 日（v2026-10-18a）。</w:t>
+        <w:t xml:space="preserve">项目：儿童游走脾系统综述（PROSPERO CRD420261520329）。草稿日期：2026 年 10 月 18 日；10 月 19 日补充"联系不上时的途径"（第 1 节、第 5 节）（v2026-10-19a）。</w:t>
       </w:r>
     </w:p>
     <w:p>
@@ -183,6 +183,113 @@
           <w:b/>
           <w:bCs/>
         </w:rPr>
+        <w:t xml:space="preserve">联系不上时的途径（2026 年 10 月 19 日补充，按顺序试）：</w:t>
+      </w:r>
+    </w:p>
+    <w:p>
+      <w:pPr>
+        <w:pStyle w:val="ListParagraph"/>
+        <w:numPr>
+          <w:ilvl w:val="1"/>
+          <w:numId w:val="3"/>
+        </w:numPr>
+        <w:spacing w:after="60"/>
+      </w:pPr>
+      <w:r>
+        <w:rPr>
+          <w:rFonts w:ascii="Calibri" w:cs="Calibri" w:eastAsia="Microsoft YaHei" w:hAnsi="Calibri"/>
+        </w:rPr>
+        <w:t xml:space="preserve">论文里印的通讯作者邮箱（中文文章看"通信作者"栏）。退信或论文没有印邮箱，才走下一步。</w:t>
+      </w:r>
+    </w:p>
+    <w:p>
+      <w:pPr>
+        <w:pStyle w:val="ListParagraph"/>
+        <w:numPr>
+          <w:ilvl w:val="1"/>
+          <w:numId w:val="3"/>
+        </w:numPr>
+        <w:spacing w:after="60"/>
+      </w:pPr>
+      <w:r>
+        <w:rPr>
+          <w:rFonts w:ascii="Calibri" w:cs="Calibri" w:eastAsia="Microsoft YaHei" w:hAnsi="Calibri"/>
+        </w:rPr>
+        <w:t xml:space="preserve">作者所在医院或科室的公开页面上的联系方式。</w:t>
+      </w:r>
+    </w:p>
+    <w:p>
+      <w:pPr>
+        <w:pStyle w:val="ListParagraph"/>
+        <w:numPr>
+          <w:ilvl w:val="1"/>
+          <w:numId w:val="3"/>
+        </w:numPr>
+        <w:spacing w:after="60"/>
+      </w:pPr>
+      <w:r>
+        <w:rPr>
+          <w:rFonts w:ascii="Calibri" w:cs="Calibri" w:eastAsia="Microsoft YaHei" w:hAnsi="Calibri"/>
+        </w:rPr>
+        <w:t xml:space="preserve">期刊编辑部转交：请编辑部把邮件转给通讯作者，并说明这是系统综述的数据索取。编辑部是否肯转交，没有核实。</w:t>
+      </w:r>
+    </w:p>
+    <w:p>
+      <w:pPr>
+        <w:pStyle w:val="ListParagraph"/>
+        <w:numPr>
+          <w:ilvl w:val="1"/>
+          <w:numId w:val="3"/>
+        </w:numPr>
+        <w:spacing w:after="60"/>
+      </w:pPr>
+      <w:r>
+        <w:rPr>
+          <w:rFonts w:ascii="Calibri" w:cs="Calibri" w:eastAsia="Microsoft YaHei" w:hAnsi="Calibri"/>
+        </w:rPr>
+        <w:t xml:space="preserve">熟人转达：请认识该科室的小儿外科同行转交邮件或引荐。有没有这样的人，由舒俊、杨俊自己判断。</w:t>
+      </w:r>
+    </w:p>
+    <w:p>
+      <w:pPr>
+        <w:spacing w:after="120"/>
+      </w:pPr>
+      <w:r>
+        <w:rPr>
+          <w:rFonts w:ascii="Calibri" w:cs="Calibri" w:eastAsia="Microsoft YaHei" w:hAnsi="Calibri"/>
+        </w:rPr>
+        <w:t xml:space="preserve">无论走哪条途径，转出去的都是同一封邮件，不另写说明，不附任何东西。</w:t>
+      </w:r>
+      <w:r>
+        <w:rPr>
+          <w:rFonts w:ascii="Calibri" w:cs="Calibri" w:eastAsia="Microsoft YaHei" w:hAnsi="Calibri"/>
+          <w:b/>
+          <w:bCs/>
+        </w:rPr>
+        <w:t xml:space="preserve">8 周的期限不因此延长</w:t>
+      </w:r>
+      <w:r>
+        <w:rPr>
+          <w:rFonts w:ascii="Calibri" w:cs="Calibri" w:eastAsia="Microsoft YaHei" w:hAnsi="Calibri"/>
+        </w:rPr>
+        <w:t xml:space="preserve">（从第一封算起，见下面的时间表）。第 2 步以后每走一步，都在 IPD_requests 表里登记（见第 5 节）。</w:t>
+      </w:r>
+    </w:p>
+    <w:p>
+      <w:pPr>
+        <w:pStyle w:val="ListParagraph"/>
+        <w:numPr>
+          <w:ilvl w:val="0"/>
+          <w:numId w:val="2"/>
+        </w:numPr>
+        <w:spacing w:after="60"/>
+      </w:pPr>
+      <w:r>
+        <w:rPr>
+          <w:rFonts w:ascii="Calibri" w:cs="Calibri" w:eastAsia="Microsoft YaHei" w:hAnsi="Calibri"/>
+          <w:b/>
+          <w:bCs/>
+        </w:rPr>
         <w:t xml:space="preserve">谁发：</w:t>
       </w:r>
       <w:r>
@@ -1607,6 +1714,30 @@
           <w:b/>
           <w:bCs/>
         </w:rPr>
+        <w:t xml:space="preserve">联系途径的登记（2026 年 10 月 19 日补充）：</w:t>
+      </w:r>
+      <w:r>
+        <w:rPr>
+          <w:rFonts w:ascii="Calibri" w:cs="Calibri" w:eastAsia="Microsoft YaHei" w:hAnsi="Calibri"/>
+        </w:rPr>
+        <w:t xml:space="preserve"> 每次联系记一行：日期、谁联系的、用了哪条途径（论文邮箱 / 机构页面 / 编辑部转交 / 熟人转达）、结果（已送达 / 退信 / 没有回音 / 已回复）。邮箱地址本身不记；退信只记日期和原因，退信邮件不放进仓库。</w:t>
+      </w:r>
+    </w:p>
+    <w:p>
+      <w:pPr>
+        <w:pStyle w:val="ListParagraph"/>
+        <w:numPr>
+          <w:ilvl w:val="0"/>
+          <w:numId w:val="2"/>
+        </w:numPr>
+        <w:spacing w:after="60"/>
+      </w:pPr>
+      <w:r>
+        <w:rPr>
+          <w:rFonts w:ascii="Calibri" w:cs="Calibri" w:eastAsia="Microsoft YaHei" w:hAnsi="Calibri"/>
+          <w:b/>
+          <w:bCs/>
+        </w:rPr>
         <w:t xml:space="preserve">收到数据后：</w:t>
       </w:r>
       <w:r>
@@ -1661,7 +1792,7 @@
         <w:rPr>
           <w:rFonts w:ascii="Calibri" w:cs="Calibri" w:eastAsia="Microsoft YaHei" w:hAnsi="Calibri"/>
         </w:rPr>
-        <w:t xml:space="preserve"> 发出几封邮件、几位作者回复、几位提供了数据、各占多少儿童；有没有作者拒绝或表示无法提供。这些数字要等真的发完才有，现在不能写。</w:t>
+        <w:t xml:space="preserve"> 发出几封邮件、几位作者回复、几位提供了数据、各占多少儿童；有没有作者拒绝或表示无法提供；有几位作者各条途径都联系不上（退信、没有邮箱、没有回音），以及用过哪些途径（一句话）。这些数字要等真的发完才有，现在不能写。</w:t>
       </w:r>
     </w:p>
     <w:p>
@@ -2213,7 +2344,7 @@
         <w:sz w:val="17"/>
         <w:szCs w:val="17"/>
       </w:rPr>
-      <w:t xml:space="preserve">IPD 索取邮件 v2026-10-18a   |   第 </w:t>
+      <w:t xml:space="preserve">IPD 索取邮件 v2026-10-19a   |   第 </w:t>
     </w:r>
     <w:r>
       <w:rPr>
@@ -2413,6 +2544,12 @@
   </w:num>
   <w:num w:numId="2">
     <w:abstractNumId w:val="2"/>
+    <w:lvlOverride w:ilvl="0">
+      <w:startOverride w:val="1"/>
+    </w:lvlOverride>
+  </w:num>
+  <w:num w:numId="3">
+    <w:abstractNumId w:val="3"/>
     <w:lvlOverride w:ilvl="0">
       <w:startOverride w:val="1"/>
     </w:lvlOverride>

</xml_diff>

<commit_message>
Add contact-log columns to IPD_requests; fix narrative-only status matching in finalize_fulltext
Co-Authored-By: Claude Sonnet 5.5 <noreply@anthropic.com>
Claude-Session: https://claude.ai/code/session_01FRD7etKqYN8v2bbXeeLMRW
</commit_message>
<xml_diff>
--- a/IPD request emails (draft).docx
+++ b/IPD request emails (draft).docx
@@ -22,7 +22,7 @@
         <w:rPr>
           <w:rFonts w:ascii="Calibri" w:cs="Calibri" w:eastAsia="Microsoft YaHei" w:hAnsi="Calibri"/>
         </w:rPr>
-        <w:t xml:space="preserve">项目：儿童游走脾系统综述（PROSPERO CRD420261520329）。草稿日期：2026 年 10 月 18 日；10 月 19 日补充"联系不上时的途径"（第 1 节、第 5 节）（v2026-10-19a）。</w:t>
+        <w:t xml:space="preserve">项目：儿童游走脾系统综述（PROSPERO CRD420261520329）。草稿日期：2026 年 10 月 18 日；10 月 19 日补充"联系不上时的途径"（第 1 节、第 5 节）和 IPD_requests 表的联系记录列（v2026-10-19b）。</w:t>
       </w:r>
     </w:p>
     <w:p>
@@ -1714,13 +1714,88 @@
           <w:b/>
           <w:bCs/>
         </w:rPr>
-        <w:t xml:space="preserve">联系途径的登记（2026 年 10 月 19 日补充）：</w:t>
-      </w:r>
-      <w:r>
-        <w:rPr>
-          <w:rFonts w:ascii="Calibri" w:cs="Calibri" w:eastAsia="Microsoft YaHei" w:hAnsi="Calibri"/>
-        </w:rPr>
-        <w:t xml:space="preserve"> 每次联系记一行：日期、谁联系的、用了哪条途径（论文邮箱 / 机构页面 / 编辑部转交 / 熟人转达）、结果（已送达 / 退信 / 没有回音 / 已回复）。邮箱地址本身不记；退信只记日期和原因，退信邮件不放进仓库。</w:t>
+        <w:t xml:space="preserve">联系途径的登记（IPD_requests 表的联系记录列，2026 年 10 月 19 日补充）：</w:t>
+      </w:r>
+      <w:r>
+        <w:rPr>
+          <w:rFonts w:ascii="Calibri" w:cs="Calibri" w:eastAsia="Microsoft YaHei" w:hAnsi="Calibri"/>
+        </w:rPr>
+        <w:t xml:space="preserve"> </w:t>
+      </w:r>
+      <w:r>
+        <w:rPr>
+          <w:rFonts w:ascii="Consolas" w:cs="Consolas" w:eastAsia="Microsoft YaHei" w:hAnsi="Consolas"/>
+          <w:sz w:val="19"/>
+          <w:szCs w:val="19"/>
+          <w:shd w:fill="EEEEEE" w:val="clear"/>
+        </w:rPr>
+        <w:t xml:space="preserve">delivery_result</w:t>
+      </w:r>
+      <w:r>
+        <w:rPr>
+          <w:rFonts w:ascii="Calibri" w:cs="Calibri" w:eastAsia="Microsoft YaHei" w:hAnsi="Calibri"/>
+        </w:rPr>
+        <w:t xml:space="preserve"> 记第一封的结果（Not yet sent / Sent, no bounce / Bounced / No address found）；论文邮箱之外用过的途径写在 </w:t>
+      </w:r>
+      <w:r>
+        <w:rPr>
+          <w:rFonts w:ascii="Consolas" w:cs="Consolas" w:eastAsia="Microsoft YaHei" w:hAnsi="Consolas"/>
+          <w:sz w:val="19"/>
+          <w:szCs w:val="19"/>
+          <w:shd w:fill="EEEEEE" w:val="clear"/>
+        </w:rPr>
+        <w:t xml:space="preserve">other_routes</w:t>
+      </w:r>
+      <w:r>
+        <w:rPr>
+          <w:rFonts w:ascii="Calibri" w:cs="Calibri" w:eastAsia="Microsoft YaHei" w:hAnsi="Calibri"/>
+        </w:rPr>
+        <w:t xml:space="preserve">（Institution page; Journal editorial office; Colleague; Other），第一次用的日期写在 </w:t>
+      </w:r>
+      <w:r>
+        <w:rPr>
+          <w:rFonts w:ascii="Consolas" w:cs="Consolas" w:eastAsia="Microsoft YaHei" w:hAnsi="Consolas"/>
+          <w:sz w:val="19"/>
+          <w:szCs w:val="19"/>
+          <w:shd w:fill="EEEEEE" w:val="clear"/>
+        </w:rPr>
+        <w:t xml:space="preserve">other_route_date</w:t>
+      </w:r>
+      <w:r>
+        <w:rPr>
+          <w:rFonts w:ascii="Calibri" w:cs="Calibri" w:eastAsia="Microsoft YaHei" w:hAnsi="Calibri"/>
+        </w:rPr>
+        <w:t xml:space="preserve">；</w:t>
+      </w:r>
+      <w:r>
+        <w:rPr>
+          <w:rFonts w:ascii="Consolas" w:cs="Consolas" w:eastAsia="Microsoft YaHei" w:hAnsi="Consolas"/>
+          <w:sz w:val="19"/>
+          <w:szCs w:val="19"/>
+          <w:shd w:fill="EEEEEE" w:val="clear"/>
+        </w:rPr>
+        <w:t xml:space="preserve">contact_log</w:t>
+      </w:r>
+      <w:r>
+        <w:rPr>
+          <w:rFonts w:ascii="Calibri" w:cs="Calibri" w:eastAsia="Microsoft YaHei" w:hAnsi="Calibri"/>
+        </w:rPr>
+        <w:t xml:space="preserve"> 每次联系写一行（日期；发件人缩写；途径；结果）；</w:t>
+      </w:r>
+      <w:r>
+        <w:rPr>
+          <w:rFonts w:ascii="Consolas" w:cs="Consolas" w:eastAsia="Microsoft YaHei" w:hAnsi="Consolas"/>
+          <w:sz w:val="19"/>
+          <w:szCs w:val="19"/>
+          <w:shd w:fill="EEEEEE" w:val="clear"/>
+        </w:rPr>
+        <w:t xml:space="preserve">author_reached</w:t>
+      </w:r>
+      <w:r>
+        <w:rPr>
+          <w:rFonts w:ascii="Calibri" w:cs="Calibri" w:eastAsia="Microsoft YaHei" w:hAnsi="Calibri"/>
+        </w:rPr>
+        <w:t xml:space="preserve"> 先填 Pending，有回复或转交方确认已送达填 Yes，到期（从第一封起 8 周）各条途径都试过、既无回复也无送达确认才填 No，到期前不填 No。邮箱地址不记；退信只记日期和原因，退信邮件不放进仓库。</w:t>
       </w:r>
     </w:p>
     <w:p>
@@ -1792,7 +1867,37 @@
         <w:rPr>
           <w:rFonts w:ascii="Calibri" w:cs="Calibri" w:eastAsia="Microsoft YaHei" w:hAnsi="Calibri"/>
         </w:rPr>
-        <w:t xml:space="preserve"> 发出几封邮件、几位作者回复、几位提供了数据、各占多少儿童；有没有作者拒绝或表示无法提供；有几位作者各条途径都联系不上（退信、没有邮箱、没有回音），以及用过哪些途径（一句话）。这些数字要等真的发完才有，现在不能写。</w:t>
+        <w:t xml:space="preserve"> 发出几封邮件、几位作者回复、几位提供了数据、各占多少儿童；有没有作者拒绝或表示无法提供；有几位作者各条途径都联系不上（</w:t>
+      </w:r>
+      <w:r>
+        <w:rPr>
+          <w:rFonts w:ascii="Consolas" w:cs="Consolas" w:eastAsia="Microsoft YaHei" w:hAnsi="Consolas"/>
+          <w:sz w:val="19"/>
+          <w:szCs w:val="19"/>
+          <w:shd w:fill="EEEEEE" w:val="clear"/>
+        </w:rPr>
+        <w:t xml:space="preserve">author_reached</w:t>
+      </w:r>
+      <w:r>
+        <w:rPr>
+          <w:rFonts w:ascii="Calibri" w:cs="Calibri" w:eastAsia="Microsoft YaHei" w:hAnsi="Calibri"/>
+        </w:rPr>
+        <w:t xml:space="preserve"> = No 的报告数；同一位作者的几篇报告只算一位），以及用过哪些途径（一句话，取自 </w:t>
+      </w:r>
+      <w:r>
+        <w:rPr>
+          <w:rFonts w:ascii="Consolas" w:cs="Consolas" w:eastAsia="Microsoft YaHei" w:hAnsi="Consolas"/>
+          <w:sz w:val="19"/>
+          <w:szCs w:val="19"/>
+          <w:shd w:fill="EEEEEE" w:val="clear"/>
+        </w:rPr>
+        <w:t xml:space="preserve">other_routes</w:t>
+      </w:r>
+      <w:r>
+        <w:rPr>
+          <w:rFonts w:ascii="Calibri" w:cs="Calibri" w:eastAsia="Microsoft YaHei" w:hAnsi="Calibri"/>
+        </w:rPr>
+        <w:t xml:space="preserve">）。这些数字要等真的发完才有，现在不能写。</w:t>
       </w:r>
     </w:p>
     <w:p>
@@ -2344,7 +2449,7 @@
         <w:sz w:val="17"/>
         <w:szCs w:val="17"/>
       </w:rPr>
-      <w:t xml:space="preserve">IPD 索取邮件 v2026-10-19a   |   第 </w:t>
+      <w:t xml:space="preserve">IPD 索取邮件 v2026-10-19b   |   第 </w:t>
     </w:r>
     <w:r>
       <w:rPr>

</xml_diff>